<commit_message>
add cv profile image extractor
</commit_message>
<xml_diff>
--- a/Delta_Template.docx
+++ b/Delta_Template.docx
@@ -235,11 +235,9 @@
       <w:pPr>
         <w:pStyle w:val="CustomHeading"/>
       </w:pPr>
-      <w:proofErr w:type="spellStart"/>
       <w:r>
         <w:t>Kjernekompetanse</w:t>
       </w:r>
-      <w:proofErr w:type="spellEnd"/>
     </w:p>
     <w:p>
       <w:r>
@@ -255,11 +253,12 @@
       <w:pPr>
         <w:pStyle w:val="CustomHeading"/>
       </w:pPr>
-      <w:proofErr w:type="spellStart"/>
       <w:r>
-        <w:t>Erfaring</w:t>
+        <w:t>Utvalgt</w:t>
       </w:r>
-      <w:proofErr w:type="spellEnd"/>
+      <w:r>
+        <w:t xml:space="preserve"> erfaring</w:t>
+      </w:r>
     </w:p>
     <w:p>
       <w:pPr>
@@ -278,15 +277,7 @@
     </w:p>
     <w:p>
       <w:r>
-        <w:t>{{ROLE_CLIENT_</w:t>
-      </w:r>
-      <w:proofErr w:type="gramStart"/>
-      <w:r>
-        <w:t>CONTEXT}}.</w:t>
-      </w:r>
-      <w:proofErr w:type="gramEnd"/>
-      <w:r>
-        <w:t xml:space="preserve"> {{ROLE_SUMMARY}}</w:t>
+        <w:t>{{ROLE_CLIENT_CONTEXT}}. {{ROLE_SUMMARY}}</w:t>
       </w:r>
     </w:p>
     <w:p>
@@ -294,16 +285,146 @@
         <w:t>{{ROLE_BULLETS}}</w:t>
       </w:r>
     </w:p>
+    <w:p>
+      <w:r>
+        <w:t>{{</w:t>
+      </w:r>
+      <w:r>
+        <w:t>ROLE</w:t>
+      </w:r>
+      <w:r>
+        <w:t>_COMPETENCE_LINE}}</w:t>
+      </w:r>
+    </w:p>
     <w:p/>
     <w:p>
       <w:pPr>
         <w:pStyle w:val="CustomHeading"/>
       </w:pPr>
-      <w:proofErr w:type="spellStart"/>
+      <w:r>
+        <w:t>Øvrig erfaring</w:t>
+      </w:r>
+    </w:p>
+    <w:p>
+      <w:pPr>
+        <w:rPr>
+          <w:b/>
+          <w:bCs/>
+        </w:rPr>
+      </w:pPr>
+      <w:r>
+        <w:rPr>
+          <w:b/>
+          <w:bCs/>
+        </w:rPr>
+        <w:t>{{</w:t>
+      </w:r>
+      <w:r>
+        <w:rPr>
+          <w:b/>
+          <w:bCs/>
+        </w:rPr>
+        <w:t>SHORT</w:t>
+      </w:r>
+      <w:r>
+        <w:rPr>
+          <w:b/>
+          <w:bCs/>
+        </w:rPr>
+        <w:t>_</w:t>
+      </w:r>
+      <w:r>
+        <w:rPr>
+          <w:b/>
+          <w:bCs/>
+        </w:rPr>
+        <w:t>ROLE_TITLE}} – {{</w:t>
+      </w:r>
+      <w:r>
+        <w:rPr>
+          <w:b/>
+          <w:bCs/>
+        </w:rPr>
+        <w:t>SHORT</w:t>
+      </w:r>
+      <w:r>
+        <w:rPr>
+          <w:b/>
+          <w:bCs/>
+        </w:rPr>
+        <w:t>_</w:t>
+      </w:r>
+      <w:r>
+        <w:rPr>
+          <w:b/>
+          <w:bCs/>
+        </w:rPr>
+        <w:t>ROLE_COMPANY}} ({{</w:t>
+      </w:r>
+      <w:r>
+        <w:rPr>
+          <w:b/>
+          <w:bCs/>
+        </w:rPr>
+        <w:t>SHORT</w:t>
+      </w:r>
+      <w:r>
+        <w:rPr>
+          <w:b/>
+          <w:bCs/>
+        </w:rPr>
+        <w:t>_</w:t>
+      </w:r>
+      <w:r>
+        <w:rPr>
+          <w:b/>
+          <w:bCs/>
+        </w:rPr>
+        <w:t>ROLE_PERIOD}})</w:t>
+      </w:r>
+    </w:p>
+    <w:p>
+      <w:r>
+        <w:t>{{</w:t>
+      </w:r>
+      <w:r>
+        <w:t>SHORT</w:t>
+      </w:r>
+      <w:r>
+        <w:t>_</w:t>
+      </w:r>
+      <w:r>
+        <w:t>ROLE_CLIENT_CONTEXT}}. {{</w:t>
+      </w:r>
+      <w:r>
+        <w:t>SHORT</w:t>
+      </w:r>
+      <w:r>
+        <w:t>_</w:t>
+      </w:r>
+      <w:r>
+        <w:t>ROLE_SUMMARY}}</w:t>
+      </w:r>
+    </w:p>
+    <w:p>
+      <w:r>
+        <w:t>{{</w:t>
+      </w:r>
+      <w:r>
+        <w:t>SHORT_ROLE</w:t>
+      </w:r>
+      <w:r>
+        <w:t>_COMPETENCE_LINE}}</w:t>
+      </w:r>
+    </w:p>
+    <w:p/>
+    <w:p>
+      <w:pPr>
+        <w:pStyle w:val="CustomHeading"/>
+      </w:pPr>
       <w:r>
         <w:t>Utdanning</w:t>
       </w:r>
-      <w:proofErr w:type="spellEnd"/>
     </w:p>
     <w:p>
       <w:r>
@@ -319,11 +440,9 @@
       <w:pPr>
         <w:pStyle w:val="CustomHeading"/>
       </w:pPr>
-      <w:proofErr w:type="spellStart"/>
       <w:r>
         <w:t>Sertifiseringer</w:t>
       </w:r>
-      <w:proofErr w:type="spellEnd"/>
     </w:p>
     <w:p>
       <w:r>
@@ -339,11 +458,9 @@
       <w:pPr>
         <w:pStyle w:val="CustomHeading"/>
       </w:pPr>
-      <w:proofErr w:type="spellStart"/>
       <w:r>
         <w:t>Språk</w:t>
       </w:r>
-      <w:proofErr w:type="spellEnd"/>
     </w:p>
     <w:p>
       <w:r>

</xml_diff>